<commit_message>
MRP split into three handouts: Proposal (5), Draft (10), and the project doc as the Final Draft (35); one assessment table per Canvas assignment
</commit_message>
<xml_diff>
--- a/week-11-launch-and-topic/Multimodal Research Project TCE 284.docx
+++ b/week-11-launch-and-topic/Multimodal Research Project TCE 284.docx
@@ -861,8 +861,9 @@
       <w:pPr>
         <w:numPr>
           <w:ilvl w:val="0"/>
-          <w:numId w:val="1"/>
+          <w:numId w:val="4"/>
         </w:numPr>
+        <w:ind w:left="360" w:hanging="360"/>
       </w:pPr>
       <w:r>
         <w:rPr>
@@ -872,7 +873,7 @@
           <w:sz w:val="22"/>
           <w:szCs w:val="22"/>
         </w:rPr>
-        <w:t>Proposal (5 pts. — Due Friday, Nov 6 at 11:59 p.m.)</w:t>
+        <w:t xml:space="preserve">Proposal (5 pts. — Due Friday, Nov 6 at 11:59 p.m.)</w:t>
       </w:r>
       <w:r>
         <w:rPr>
@@ -880,15 +881,16 @@
           <w:sz w:val="22"/>
           <w:szCs w:val="22"/>
         </w:rPr>
-        <w:t>, built from your Topic Map: (a) your topic; (b) what you already know; (c) what you want to learn; (d) your research questions; (e) your research plan; and (f) a preliminary source list naming at least a primary source you can gather, one peer-reviewed article, and one long-form work.</w:t>
+        <w:t xml:space="preserve">. See the MRP Proposal handout.</w:t>
       </w:r>
     </w:p>
     <w:p>
       <w:pPr>
         <w:numPr>
           <w:ilvl w:val="0"/>
-          <w:numId w:val="1"/>
+          <w:numId w:val="4"/>
         </w:numPr>
+        <w:ind w:left="360" w:hanging="360"/>
       </w:pPr>
       <w:r>
         <w:rPr>
@@ -898,7 +900,7 @@
           <w:sz w:val="22"/>
           <w:szCs w:val="22"/>
         </w:rPr>
-        <w:t>Draft (10 pts. — Due Friday, Nov 20 at 11:59 p.m.)</w:t>
+        <w:t xml:space="preserve">Draft (10 pts. — Due Friday, Nov 20 at 11:59 p.m.)</w:t>
       </w:r>
       <w:r>
         <w:rPr>
@@ -906,15 +908,16 @@
           <w:sz w:val="22"/>
           <w:szCs w:val="22"/>
         </w:rPr>
-        <w:t xml:space="preserve"> including the core required elements. Include a writer’s note that tells what feedback you want and any questions you have. See the scoring rubric below.</w:t>
+        <w:t xml:space="preserve">. See the MRP Draft handout.</w:t>
       </w:r>
     </w:p>
     <w:p>
       <w:pPr>
         <w:numPr>
           <w:ilvl w:val="0"/>
-          <w:numId w:val="1"/>
+          <w:numId w:val="4"/>
         </w:numPr>
+        <w:ind w:left="360" w:hanging="360"/>
       </w:pPr>
       <w:r>
         <w:rPr>
@@ -1530,284 +1533,6 @@
                 <w:szCs w:val="24"/>
               </w:rPr>
               <w:t>None</w:t>
-            </w:r>
-          </w:p>
-        </w:tc>
-      </w:tr>
-      <w:tr>
-        <w:tc>
-          <w:tcPr>
-            <w:tcW w:w="1425" w:type="dxa"/>
-            <w:tcBorders>
-              <w:top w:val="single" w:sz="4" w:space="0" w:color="000000"/>
-              <w:left w:val="single" w:sz="4" w:space="0" w:color="000000"/>
-              <w:bottom w:val="single" w:sz="4" w:space="0" w:color="000000"/>
-              <w:right w:val="single" w:sz="4" w:space="0" w:color="000000"/>
-            </w:tcBorders>
-            <w:tcMar>
-              <w:top w:w="100" w:type="dxa"/>
-              <w:left w:w="100" w:type="dxa"/>
-              <w:bottom w:w="100" w:type="dxa"/>
-              <w:right w:w="100" w:type="dxa"/>
-            </w:tcMar>
-          </w:tcPr>
-          <w:p>
-            <w:r>
-              <w:rPr>
-                <w:rFonts w:ascii="Calibri" w:hAnsi="Calibri" w:cs="Calibri"/>
-                <w:b/>
-                <w:bCs/>
-                <w:sz w:val="22"/>
-                <w:szCs w:val="24"/>
-              </w:rPr>
-              <w:t>Proposal</w:t>
-            </w:r>
-          </w:p>
-        </w:tc>
-        <w:tc>
-          <w:tcPr>
-            <w:tcW w:w="570" w:type="dxa"/>
-            <w:tcBorders>
-              <w:top w:val="single" w:sz="4" w:space="0" w:color="000000"/>
-              <w:left w:val="single" w:sz="4" w:space="0" w:color="000000"/>
-              <w:bottom w:val="single" w:sz="4" w:space="0" w:color="000000"/>
-              <w:right w:val="single" w:sz="4" w:space="0" w:color="000000"/>
-            </w:tcBorders>
-            <w:tcMar>
-              <w:top w:w="100" w:type="dxa"/>
-              <w:left w:w="100" w:type="dxa"/>
-              <w:bottom w:w="100" w:type="dxa"/>
-              <w:right w:w="100" w:type="dxa"/>
-            </w:tcMar>
-          </w:tcPr>
-          <w:p>
-            <w:r>
-              <w:rPr>
-                <w:rFonts w:ascii="Calibri" w:hAnsi="Calibri" w:cs="Calibri"/>
-                <w:sz w:val="22"/>
-                <w:szCs w:val="24"/>
-              </w:rPr>
-              <w:t>5</w:t>
-            </w:r>
-          </w:p>
-        </w:tc>
-        <w:tc>
-          <w:tcPr>
-            <w:tcW w:w="3090" w:type="dxa"/>
-            <w:tcBorders>
-              <w:top w:val="single" w:sz="4" w:space="0" w:color="000000"/>
-              <w:left w:val="single" w:sz="4" w:space="0" w:color="000000"/>
-              <w:bottom w:val="single" w:sz="4" w:space="0" w:color="000000"/>
-              <w:right w:val="single" w:sz="4" w:space="0" w:color="000000"/>
-            </w:tcBorders>
-            <w:tcMar>
-              <w:top w:w="100" w:type="dxa"/>
-              <w:left w:w="100" w:type="dxa"/>
-              <w:bottom w:w="100" w:type="dxa"/>
-              <w:right w:w="100" w:type="dxa"/>
-            </w:tcMar>
-          </w:tcPr>
-          <w:p>
-            <w:r>
-              <w:rPr>
-                <w:rFonts w:ascii="Calibri" w:hAnsi="Calibri" w:cs="Calibri"/>
-                <w:sz w:val="22"/>
-                <w:szCs w:val="24"/>
-              </w:rPr>
-              <w:t>All six Topic-Map components present and thought through</w:t>
-            </w:r>
-          </w:p>
-        </w:tc>
-        <w:tc>
-          <w:tcPr>
-            <w:tcW w:w="3000" w:type="dxa"/>
-            <w:tcBorders>
-              <w:top w:val="single" w:sz="4" w:space="0" w:color="000000"/>
-              <w:left w:val="single" w:sz="4" w:space="0" w:color="000000"/>
-              <w:bottom w:val="single" w:sz="4" w:space="0" w:color="000000"/>
-              <w:right w:val="single" w:sz="4" w:space="0" w:color="000000"/>
-            </w:tcBorders>
-            <w:tcMar>
-              <w:top w:w="100" w:type="dxa"/>
-              <w:left w:w="100" w:type="dxa"/>
-              <w:bottom w:w="100" w:type="dxa"/>
-              <w:right w:w="100" w:type="dxa"/>
-            </w:tcMar>
-          </w:tcPr>
-          <w:p>
-            <w:r>
-              <w:rPr>
-                <w:rFonts w:ascii="Calibri" w:hAnsi="Calibri" w:cs="Calibri"/>
-                <w:sz w:val="22"/>
-                <w:szCs w:val="24"/>
-              </w:rPr>
-              <w:t>Partial at instructor discretion</w:t>
-            </w:r>
-          </w:p>
-        </w:tc>
-        <w:tc>
-          <w:tcPr>
-            <w:tcW w:w="2715" w:type="dxa"/>
-            <w:tcBorders>
-              <w:top w:val="single" w:sz="4" w:space="0" w:color="000000"/>
-              <w:left w:val="single" w:sz="4" w:space="0" w:color="000000"/>
-              <w:bottom w:val="single" w:sz="4" w:space="0" w:color="000000"/>
-              <w:right w:val="single" w:sz="4" w:space="0" w:color="000000"/>
-            </w:tcBorders>
-            <w:tcMar>
-              <w:top w:w="100" w:type="dxa"/>
-              <w:left w:w="100" w:type="dxa"/>
-              <w:bottom w:w="100" w:type="dxa"/>
-              <w:right w:w="100" w:type="dxa"/>
-            </w:tcMar>
-          </w:tcPr>
-          <w:p>
-            <w:r>
-              <w:rPr>
-                <w:rFonts w:ascii="Calibri" w:hAnsi="Calibri" w:cs="Calibri"/>
-                <w:sz w:val="22"/>
-                <w:szCs w:val="24"/>
-              </w:rPr>
-              <w:t>Components missing or too thin</w:t>
-            </w:r>
-          </w:p>
-        </w:tc>
-      </w:tr>
-      <w:tr>
-        <w:tc>
-          <w:tcPr>
-            <w:tcW w:w="1425" w:type="dxa"/>
-            <w:tcBorders>
-              <w:top w:val="single" w:sz="4" w:space="0" w:color="000000"/>
-              <w:left w:val="single" w:sz="4" w:space="0" w:color="000000"/>
-              <w:bottom w:val="single" w:sz="4" w:space="0" w:color="000000"/>
-              <w:right w:val="single" w:sz="4" w:space="0" w:color="000000"/>
-            </w:tcBorders>
-            <w:tcMar>
-              <w:top w:w="100" w:type="dxa"/>
-              <w:left w:w="100" w:type="dxa"/>
-              <w:bottom w:w="100" w:type="dxa"/>
-              <w:right w:w="100" w:type="dxa"/>
-            </w:tcMar>
-          </w:tcPr>
-          <w:p>
-            <w:r>
-              <w:rPr>
-                <w:rFonts w:ascii="Calibri" w:hAnsi="Calibri" w:cs="Calibri"/>
-                <w:b/>
-                <w:bCs/>
-                <w:sz w:val="22"/>
-                <w:szCs w:val="24"/>
-              </w:rPr>
-              <w:t>Draft</w:t>
-            </w:r>
-          </w:p>
-        </w:tc>
-        <w:tc>
-          <w:tcPr>
-            <w:tcW w:w="570" w:type="dxa"/>
-            <w:tcBorders>
-              <w:top w:val="single" w:sz="4" w:space="0" w:color="000000"/>
-              <w:left w:val="single" w:sz="4" w:space="0" w:color="000000"/>
-              <w:bottom w:val="single" w:sz="4" w:space="0" w:color="000000"/>
-              <w:right w:val="single" w:sz="4" w:space="0" w:color="000000"/>
-            </w:tcBorders>
-            <w:tcMar>
-              <w:top w:w="100" w:type="dxa"/>
-              <w:left w:w="100" w:type="dxa"/>
-              <w:bottom w:w="100" w:type="dxa"/>
-              <w:right w:w="100" w:type="dxa"/>
-            </w:tcMar>
-          </w:tcPr>
-          <w:p>
-            <w:r>
-              <w:rPr>
-                <w:rFonts w:ascii="Calibri" w:hAnsi="Calibri" w:cs="Calibri"/>
-                <w:sz w:val="22"/>
-                <w:szCs w:val="24"/>
-              </w:rPr>
-              <w:t>10</w:t>
-            </w:r>
-          </w:p>
-        </w:tc>
-        <w:tc>
-          <w:tcPr>
-            <w:tcW w:w="3090" w:type="dxa"/>
-            <w:tcBorders>
-              <w:top w:val="single" w:sz="4" w:space="0" w:color="000000"/>
-              <w:left w:val="single" w:sz="4" w:space="0" w:color="000000"/>
-              <w:bottom w:val="single" w:sz="4" w:space="0" w:color="000000"/>
-              <w:right w:val="single" w:sz="4" w:space="0" w:color="000000"/>
-            </w:tcBorders>
-            <w:tcMar>
-              <w:top w:w="100" w:type="dxa"/>
-              <w:left w:w="100" w:type="dxa"/>
-              <w:bottom w:w="100" w:type="dxa"/>
-              <w:right w:w="100" w:type="dxa"/>
-            </w:tcMar>
-          </w:tcPr>
-          <w:p>
-            <w:r>
-              <w:rPr>
-                <w:rFonts w:ascii="Calibri" w:hAnsi="Calibri" w:cs="Calibri"/>
-                <w:sz w:val="22"/>
-                <w:szCs w:val="24"/>
-              </w:rPr>
-              <w:t>A genuine full draft of the core elements, plus a writer's note</w:t>
-            </w:r>
-          </w:p>
-        </w:tc>
-        <w:tc>
-          <w:tcPr>
-            <w:tcW w:w="3000" w:type="dxa"/>
-            <w:tcBorders>
-              <w:top w:val="single" w:sz="4" w:space="0" w:color="000000"/>
-              <w:left w:val="single" w:sz="4" w:space="0" w:color="000000"/>
-              <w:bottom w:val="single" w:sz="4" w:space="0" w:color="000000"/>
-              <w:right w:val="single" w:sz="4" w:space="0" w:color="000000"/>
-            </w:tcBorders>
-            <w:tcMar>
-              <w:top w:w="100" w:type="dxa"/>
-              <w:left w:w="100" w:type="dxa"/>
-              <w:bottom w:w="100" w:type="dxa"/>
-              <w:right w:w="100" w:type="dxa"/>
-            </w:tcMar>
-          </w:tcPr>
-          <w:p>
-            <w:r>
-              <w:rPr>
-                <w:rFonts w:ascii="Calibri" w:hAnsi="Calibri" w:cs="Calibri"/>
-                <w:sz w:val="22"/>
-                <w:szCs w:val="24"/>
-              </w:rPr>
-              <w:t>Incomplete or hasty, or the note is missing</w:t>
-            </w:r>
-          </w:p>
-        </w:tc>
-        <w:tc>
-          <w:tcPr>
-            <w:tcW w:w="2715" w:type="dxa"/>
-            <w:tcBorders>
-              <w:top w:val="single" w:sz="4" w:space="0" w:color="000000"/>
-              <w:left w:val="single" w:sz="4" w:space="0" w:color="000000"/>
-              <w:bottom w:val="single" w:sz="4" w:space="0" w:color="000000"/>
-              <w:right w:val="single" w:sz="4" w:space="0" w:color="000000"/>
-            </w:tcBorders>
-            <w:tcMar>
-              <w:top w:w="100" w:type="dxa"/>
-              <w:left w:w="100" w:type="dxa"/>
-              <w:bottom w:w="100" w:type="dxa"/>
-              <w:right w:w="100" w:type="dxa"/>
-            </w:tcMar>
-          </w:tcPr>
-          <w:p>
-            <w:r>
-              <w:rPr>
-                <w:rFonts w:ascii="Calibri" w:hAnsi="Calibri" w:cs="Calibri"/>
-                <w:sz w:val="22"/>
-                <w:szCs w:val="24"/>
-              </w:rPr>
-              <w:t>Little to respond to</w:t>
             </w:r>
           </w:p>
         </w:tc>

</xml_diff>